<commit_message>
Add logic circuit matching question
</commit_message>
<xml_diff>
--- a/matching_questions/MOED-ALEPH-updated.docx
+++ b/matching_questions/MOED-ALEPH-updated.docx
@@ -26,13 +26,15 @@
           </w:tcPr>
           <w:p>
             <w:pPr>
-              <w:jc w:val="left"/>
               <w:rPr>
                 <w:lang w:bidi="he-IL"/>
               </w:rPr>
+              <w:bidi/>
+              <w:jc w:val="right"/>
             </w:pPr>
             <w:r>
               <w:rPr>
+                <w:rFonts w:ascii="Arial" w:hAnsi="Arial" w:cs="Arial"/>
                 <w:b/>
                 <w:sz w:val="144"/>
                 <w:szCs w:val="48"/>
@@ -42,7 +44,7 @@
             </w:r>
             <w:r>
               <w:rPr>
-                <w:rFonts w:hint="cs"/>
+                <w:rFonts w:hint="cs" w:ascii="Arial" w:hAnsi="Arial" w:cs="Arial"/>
                 <w:b/>
                 <w:sz w:val="144"/>
                 <w:szCs w:val="48"/>
@@ -53,6 +55,7 @@
             </w:r>
             <w:r>
               <w:rPr>
+                <w:rFonts w:ascii="Arial" w:hAnsi="Arial" w:cs="Arial"/>
                 <w:b/>
                 <w:sz w:val="72"/>
                 <w:szCs w:val="48"/>
@@ -62,7 +65,7 @@
             </w:r>
             <w:r>
               <w:rPr>
-                <w:rFonts w:hint="cs"/>
+                <w:rFonts w:hint="cs" w:ascii="Arial" w:hAnsi="Arial" w:cs="Arial"/>
                 <w:b/>
                 <w:sz w:val="72"/>
                 <w:szCs w:val="48"/>
@@ -73,6 +76,7 @@
             </w:r>
             <w:r>
               <w:rPr>
+                <w:rFonts w:ascii="Arial" w:hAnsi="Arial" w:cs="Arial"/>
                 <w:b/>
                 <w:sz w:val="72"/>
                 <w:szCs w:val="48"/>
@@ -128,10 +132,12 @@
           <w:p>
             <w:pPr>
               <w:spacing w:after="40"/>
-              <w:jc w:val="left"/>
+              <w:bidi/>
+              <w:jc w:val="right"/>
             </w:pPr>
             <w:r>
               <w:rPr>
+                <w:rFonts w:ascii="Arial" w:hAnsi="Arial" w:cs="Arial"/>
                 <w:b/>
                 <w:sz w:val="20"/>
                 <w:rtl/>
@@ -140,6 +146,7 @@
             </w:r>
             <w:r>
               <w:rPr>
+                <w:rFonts w:ascii="Arial" w:hAnsi="Arial" w:cs="Arial"/>
                 <w:sz w:val="20"/>
                 <w:rtl/>
               </w:rPr>
@@ -149,10 +156,12 @@
           <w:p>
             <w:pPr>
               <w:spacing w:after="40"/>
-              <w:jc w:val="left"/>
+              <w:bidi/>
+              <w:jc w:val="right"/>
             </w:pPr>
             <w:r>
               <w:rPr>
+                <w:rFonts w:ascii="Arial" w:hAnsi="Arial" w:cs="Arial"/>
                 <w:b/>
                 <w:sz w:val="20"/>
                 <w:rtl/>
@@ -161,6 +170,7 @@
             </w:r>
             <w:r>
               <w:rPr>
+                <w:rFonts w:ascii="Arial" w:hAnsi="Arial" w:cs="Arial"/>
                 <w:sz w:val="20"/>
                 <w:rtl/>
               </w:rPr>
@@ -170,10 +180,12 @@
           <w:p>
             <w:pPr>
               <w:spacing w:after="40"/>
-              <w:jc w:val="left"/>
+              <w:bidi/>
+              <w:jc w:val="right"/>
             </w:pPr>
             <w:r>
               <w:rPr>
+                <w:rFonts w:ascii="Arial" w:hAnsi="Arial" w:cs="Arial"/>
                 <w:b/>
                 <w:sz w:val="20"/>
                 <w:rtl/>
@@ -182,6 +194,7 @@
             </w:r>
             <w:r>
               <w:rPr>
+                <w:rFonts w:ascii="Arial" w:hAnsi="Arial" w:cs="Arial"/>
                 <w:sz w:val="20"/>
                 <w:rtl/>
               </w:rPr>
@@ -191,10 +204,12 @@
           <w:p>
             <w:pPr>
               <w:spacing w:after="40"/>
-              <w:jc w:val="left"/>
+              <w:bidi/>
+              <w:jc w:val="right"/>
             </w:pPr>
             <w:r>
               <w:rPr>
+                <w:rFonts w:ascii="Arial" w:hAnsi="Arial" w:cs="Arial"/>
                 <w:b/>
                 <w:sz w:val="20"/>
                 <w:rtl/>
@@ -203,6 +218,7 @@
             </w:r>
             <w:r>
               <w:rPr>
+                <w:rFonts w:ascii="Arial" w:hAnsi="Arial" w:cs="Arial"/>
                 <w:sz w:val="20"/>
                 <w:rtl/>
               </w:rPr>
@@ -212,10 +228,12 @@
           <w:p>
             <w:pPr>
               <w:spacing w:after="40"/>
-              <w:jc w:val="left"/>
+              <w:bidi/>
+              <w:jc w:val="right"/>
             </w:pPr>
             <w:r>
               <w:rPr>
+                <w:rFonts w:ascii="Arial" w:hAnsi="Arial" w:cs="Arial"/>
                 <w:b/>
                 <w:sz w:val="20"/>
                 <w:rtl/>
@@ -224,6 +242,7 @@
             </w:r>
             <w:r>
               <w:rPr>
+                <w:rFonts w:ascii="Arial" w:hAnsi="Arial" w:cs="Arial"/>
                 <w:sz w:val="20"/>
                 <w:rtl/>
               </w:rPr>
@@ -236,10 +255,12 @@
     <w:p>
       <w:pPr>
         <w:spacing w:before="200" w:after="80"/>
-        <w:jc w:val="left"/>
+        <w:bidi/>
+        <w:jc w:val="right"/>
       </w:pPr>
       <w:r>
         <w:rPr>
+          <w:rFonts w:ascii="Arial" w:hAnsi="Arial" w:cs="Arial"/>
           <w:sz w:val="22"/>
           <w:rtl/>
         </w:rPr>
@@ -249,10 +270,12 @@
     <w:p>
       <w:pPr>
         <w:spacing w:before="120" w:after="120"/>
-        <w:jc w:val="left"/>
+        <w:bidi/>
+        <w:jc w:val="right"/>
       </w:pPr>
       <w:r>
         <w:rPr>
+          <w:rFonts w:ascii="Arial" w:hAnsi="Arial" w:cs="Arial"/>
           <w:b/>
           <w:rtl/>
         </w:rPr>
@@ -262,10 +285,12 @@
     <w:p>
       <w:pPr>
         <w:spacing w:after="120"/>
-        <w:jc w:val="left"/>
+        <w:bidi/>
+        <w:jc w:val="right"/>
       </w:pPr>
       <w:r>
         <w:rPr>
+          <w:rFonts w:ascii="Arial" w:hAnsi="Arial" w:cs="Arial"/>
           <w:i/>
           <w:sz w:val="20"/>
           <w:rtl/>
@@ -322,10 +347,12 @@
     <w:p>
       <w:pPr>
         <w:spacing w:after="40"/>
-        <w:jc w:val="left"/>
+        <w:bidi/>
+        <w:jc w:val="right"/>
       </w:pPr>
       <w:r>
         <w:rPr>
+          <w:rFonts w:ascii="Arial" w:hAnsi="Arial" w:cs="Arial"/>
           <w:sz w:val="22"/>
           <w:rtl/>
         </w:rPr>
@@ -333,6 +360,7 @@
       </w:r>
       <w:r>
         <w:rPr>
+          <w:rFonts w:ascii="Arial" w:hAnsi="Arial" w:cs="Arial"/>
           <w:sz w:val="22"/>
           <w:rtl/>
         </w:rPr>
@@ -342,10 +370,12 @@
     <w:p>
       <w:pPr>
         <w:spacing w:after="40"/>
-        <w:jc w:val="left"/>
+        <w:bidi/>
+        <w:jc w:val="right"/>
       </w:pPr>
       <w:r>
         <w:rPr>
+          <w:rFonts w:ascii="Arial" w:hAnsi="Arial" w:cs="Arial"/>
           <w:sz w:val="22"/>
           <w:rtl/>
         </w:rPr>
@@ -355,10 +385,12 @@
     <w:p>
       <w:pPr>
         <w:spacing w:after="40"/>
-        <w:jc w:val="left"/>
+        <w:bidi/>
+        <w:jc w:val="right"/>
       </w:pPr>
       <w:r>
         <w:rPr>
+          <w:rFonts w:ascii="Arial" w:hAnsi="Arial" w:cs="Arial"/>
           <w:sz w:val="22"/>
           <w:rtl/>
         </w:rPr>
@@ -368,10 +400,12 @@
     <w:p>
       <w:pPr>
         <w:spacing w:after="40"/>
-        <w:jc w:val="left"/>
+        <w:bidi/>
+        <w:jc w:val="right"/>
       </w:pPr>
       <w:r>
         <w:rPr>
+          <w:rFonts w:ascii="Arial" w:hAnsi="Arial" w:cs="Arial"/>
           <w:sz w:val="22"/>
           <w:rtl/>
         </w:rPr>
@@ -381,10 +415,12 @@
     <w:p>
       <w:pPr>
         <w:spacing w:after="40"/>
-        <w:jc w:val="left"/>
+        <w:bidi/>
+        <w:jc w:val="right"/>
       </w:pPr>
       <w:r>
         <w:rPr>
+          <w:rFonts w:ascii="Arial" w:hAnsi="Arial" w:cs="Arial"/>
           <w:sz w:val="22"/>
           <w:rtl/>
         </w:rPr>
@@ -394,14 +430,16 @@
     <w:p>
       <w:pPr>
         <w:spacing w:after="40"/>
-        <w:jc w:val="left"/>
         <w:rPr>
           <w:sz w:val="22"/>
           <w:rtl/>
         </w:rPr>
+        <w:bidi/>
+        <w:jc w:val="right"/>
       </w:pPr>
       <w:r>
         <w:rPr>
+          <w:rFonts w:ascii="Arial" w:hAnsi="Arial" w:cs="Arial"/>
           <w:sz w:val="22"/>
           <w:rtl/>
         </w:rPr>
@@ -409,6 +447,7 @@
       </w:r>
       <w:r>
         <w:rPr>
+          <w:rFonts w:ascii="Arial" w:hAnsi="Arial" w:cs="Arial"/>
           <w:sz w:val="22"/>
           <w:rtl/>
         </w:rPr>
@@ -435,10 +474,12 @@
     <w:p>
       <w:pPr>
         <w:spacing w:before="200" w:after="120"/>
-        <w:jc w:val="left"/>
+        <w:bidi/>
+        <w:jc w:val="right"/>
       </w:pPr>
       <w:r>
         <w:rPr>
+          <w:rFonts w:ascii="Arial" w:hAnsi="Arial" w:cs="Arial"/>
           <w:b/>
           <w:rtl/>
         </w:rPr>
@@ -495,10 +536,12 @@
     <w:p>
       <w:pPr>
         <w:spacing w:after="40"/>
-        <w:jc w:val="left"/>
+        <w:bidi/>
+        <w:jc w:val="right"/>
       </w:pPr>
       <w:r>
         <w:rPr>
+          <w:rFonts w:ascii="Arial" w:hAnsi="Arial" w:cs="Arial"/>
           <w:sz w:val="22"/>
           <w:rtl/>
         </w:rPr>
@@ -508,10 +551,12 @@
     <w:p>
       <w:pPr>
         <w:spacing w:after="40"/>
-        <w:jc w:val="left"/>
+        <w:bidi/>
+        <w:jc w:val="right"/>
       </w:pPr>
       <w:r>
         <w:rPr>
+          <w:rFonts w:ascii="Arial" w:hAnsi="Arial" w:cs="Arial"/>
           <w:sz w:val="22"/>
           <w:rtl/>
         </w:rPr>
@@ -521,10 +566,12 @@
     <w:p>
       <w:pPr>
         <w:spacing w:after="40"/>
-        <w:jc w:val="left"/>
+        <w:bidi/>
+        <w:jc w:val="right"/>
       </w:pPr>
       <w:r>
         <w:rPr>
+          <w:rFonts w:ascii="Arial" w:hAnsi="Arial" w:cs="Arial"/>
           <w:sz w:val="22"/>
           <w:rtl/>
         </w:rPr>
@@ -534,10 +581,12 @@
     <w:p>
       <w:pPr>
         <w:spacing w:after="40"/>
-        <w:jc w:val="left"/>
+        <w:bidi/>
+        <w:jc w:val="right"/>
       </w:pPr>
       <w:r>
         <w:rPr>
+          <w:rFonts w:ascii="Arial" w:hAnsi="Arial" w:cs="Arial"/>
           <w:sz w:val="22"/>
           <w:rtl/>
         </w:rPr>
@@ -547,10 +596,12 @@
     <w:p>
       <w:pPr>
         <w:spacing w:after="40"/>
-        <w:jc w:val="left"/>
+        <w:bidi/>
+        <w:jc w:val="right"/>
       </w:pPr>
       <w:r>
         <w:rPr>
+          <w:rFonts w:ascii="Arial" w:hAnsi="Arial" w:cs="Arial"/>
           <w:sz w:val="22"/>
           <w:rtl/>
         </w:rPr>
@@ -560,14 +611,196 @@
     <w:p>
       <w:pPr>
         <w:spacing w:after="40"/>
-        <w:jc w:val="left"/>
+        <w:bidi/>
+        <w:jc w:val="right"/>
       </w:pPr>
       <w:r>
         <w:rPr>
+          <w:rFonts w:ascii="Arial" w:hAnsi="Arial" w:cs="Arial"/>
           <w:sz w:val="22"/>
           <w:rtl/>
         </w:rPr>
         <w:t>ו. I1↔R3, I2↔R1, I3↔R2</w:t>
+      </w:r>
+    </w:p>
+    <w:p>
+      <w:r>
+        <w:br w:type="page"/>
+      </w:r>
+    </w:p>
+    <w:p>
+      <w:pPr>
+        <w:spacing w:before="120" w:after="120"/>
+        <w:bidi/>
+        <w:jc w:val="right"/>
+      </w:pPr>
+      <w:r>
+        <w:rPr>
+          <w:rFonts w:ascii="Arial" w:hAnsi="Arial" w:cs="Arial"/>
+          <w:b/>
+          <w:i w:val="0"/>
+          <w:sz w:val="24"/>
+          <w:rtl/>
+        </w:rPr>
+        <w:t>3. ?????? ??? ??????? ??????? ???? ?????? ??????? ???????? ???.</w:t>
+      </w:r>
+    </w:p>
+    <w:p>
+      <w:pPr>
+        <w:spacing w:after="120"/>
+        <w:bidi/>
+        <w:jc w:val="right"/>
+      </w:pPr>
+      <w:r>
+        <w:rPr>
+          <w:rFonts w:ascii="Arial" w:hAnsi="Arial" w:cs="Arial"/>
+          <w:i/>
+          <w:sz w:val="20"/>
+          <w:rtl/>
+        </w:rPr>
+        <w:t>????: ??? ???? x ??? ??? ???????, r ??? ????, y ??? ???, ?-r^+ ??? ??? ????? ?????? ???. ??? ?????? ??????? ??? ????? ?? x ??? r; ??? ???? ???? ??? x ???? ????? ??????? ?? ??? ??????, ???? ????? ??? ???? ??? ???????? ?????? ?? ?????. ???? ?????? ???? ?? ??? ?????? ?? ???????.</w:t>
+      </w:r>
+    </w:p>
+    <w:p>
+      <w:pPr>
+        <w:spacing w:after="160"/>
+        <w:jc w:val="center"/>
+      </w:pPr>
+      <w:r>
+        <w:drawing>
+          <wp:inline xmlns:a="http://schemas.openxmlformats.org/drawingml/2006/main" xmlns:pic="http://schemas.openxmlformats.org/drawingml/2006/picture">
+            <wp:extent cx="6080760" cy="3198917"/>
+            <wp:docPr id="3" name="Picture 3"/>
+            <wp:cNvGraphicFramePr>
+              <a:graphicFrameLocks noChangeAspect="1"/>
+            </wp:cNvGraphicFramePr>
+            <a:graphic>
+              <a:graphicData uri="http://schemas.openxmlformats.org/drawingml/2006/picture">
+                <pic:pic>
+                  <pic:nvPicPr>
+                    <pic:cNvPr id="0" name="logic_circuits_matching_matrix.png"/>
+                    <pic:cNvPicPr/>
+                  </pic:nvPicPr>
+                  <pic:blipFill>
+                    <a:blip r:embed="rId10"/>
+                    <a:stretch>
+                      <a:fillRect/>
+                    </a:stretch>
+                  </pic:blipFill>
+                  <pic:spPr>
+                    <a:xfrm>
+                      <a:off x="0" y="0"/>
+                      <a:ext cx="6080760" cy="3198917"/>
+                    </a:xfrm>
+                    <a:prstGeom prst="rect"/>
+                  </pic:spPr>
+                </pic:pic>
+              </a:graphicData>
+            </a:graphic>
+          </wp:inline>
+        </w:drawing>
+      </w:r>
+    </w:p>
+    <w:p>
+      <w:pPr>
+        <w:spacing w:after="40"/>
+        <w:bidi/>
+        <w:jc w:val="right"/>
+      </w:pPr>
+      <w:r>
+        <w:rPr>
+          <w:rFonts w:ascii="Arial" w:hAnsi="Arial" w:cs="Arial"/>
+          <w:b w:val="0"/>
+          <w:i w:val="0"/>
+          <w:sz w:val="22"/>
+          <w:rtl/>
+        </w:rPr>
+        <w:t>?. T1?C1, T2?C2, T3?C3</w:t>
+      </w:r>
+    </w:p>
+    <w:p>
+      <w:pPr>
+        <w:spacing w:after="40"/>
+        <w:bidi/>
+        <w:jc w:val="right"/>
+      </w:pPr>
+      <w:r>
+        <w:rPr>
+          <w:rFonts w:ascii="Arial" w:hAnsi="Arial" w:cs="Arial"/>
+          <w:b w:val="0"/>
+          <w:i w:val="0"/>
+          <w:sz w:val="22"/>
+          <w:rtl/>
+        </w:rPr>
+        <w:t>?. T1?C3, T2?C1, T3?C2</w:t>
+      </w:r>
+    </w:p>
+    <w:p>
+      <w:pPr>
+        <w:spacing w:after="40"/>
+        <w:bidi/>
+        <w:jc w:val="right"/>
+      </w:pPr>
+      <w:r>
+        <w:rPr>
+          <w:rFonts w:ascii="Arial" w:hAnsi="Arial" w:cs="Arial"/>
+          <w:b w:val="0"/>
+          <w:i w:val="0"/>
+          <w:sz w:val="22"/>
+          <w:rtl/>
+        </w:rPr>
+        <w:t>?. T1?C2, T2?C3, T3?C1</w:t>
+      </w:r>
+    </w:p>
+    <w:p>
+      <w:pPr>
+        <w:spacing w:after="40"/>
+        <w:bidi/>
+        <w:jc w:val="right"/>
+      </w:pPr>
+      <w:r>
+        <w:rPr>
+          <w:rFonts w:ascii="Arial" w:hAnsi="Arial" w:cs="Arial"/>
+          <w:b w:val="0"/>
+          <w:i w:val="0"/>
+          <w:sz w:val="22"/>
+          <w:rtl/>
+        </w:rPr>
+        <w:t>?. T1?C1, T2?C3, T3?C2</w:t>
+      </w:r>
+    </w:p>
+    <w:p>
+      <w:pPr>
+        <w:spacing w:after="40"/>
+        <w:bidi/>
+        <w:jc w:val="right"/>
+      </w:pPr>
+      <w:r>
+        <w:rPr>
+          <w:rFonts w:ascii="Arial" w:hAnsi="Arial" w:cs="Arial"/>
+          <w:b w:val="0"/>
+          <w:i w:val="0"/>
+          <w:sz w:val="22"/>
+          <w:rtl/>
+        </w:rPr>
+        <w:t>?. T1?C2, T2?C1, T3?C3</w:t>
+      </w:r>
+    </w:p>
+    <w:p>
+      <w:pPr>
+        <w:spacing w:after="40"/>
+        <w:bidi/>
+        <w:jc w:val="right"/>
+      </w:pPr>
+      <w:r>
+        <w:rPr>
+          <w:rFonts w:ascii="Arial" w:hAnsi="Arial" w:cs="Arial"/>
+          <w:b w:val="0"/>
+          <w:i w:val="0"/>
+          <w:sz w:val="22"/>
+          <w:rtl/>
+        </w:rPr>
+        <w:t>?. T1?C3, T2?C2, T3?C1</w:t>
       </w:r>
     </w:p>
     <w:sectPr>

</xml_diff>

<commit_message>
Add NanoPromela unfolding question
</commit_message>
<xml_diff>
--- a/matching_questions/MOED-ALEPH-updated.docx
+++ b/matching_questions/MOED-ALEPH-updated.docx
@@ -26,15 +26,13 @@
           </w:tcPr>
           <w:p>
             <w:pPr>
+              <w:jc w:val="left"/>
               <w:rPr>
                 <w:lang w:bidi="he-IL"/>
               </w:rPr>
-              <w:bidi/>
-              <w:jc w:val="right"/>
             </w:pPr>
             <w:r>
               <w:rPr>
-                <w:rFonts w:ascii="Arial" w:hAnsi="Arial" w:cs="Arial"/>
                 <w:b/>
                 <w:sz w:val="144"/>
                 <w:szCs w:val="48"/>
@@ -44,7 +42,7 @@
             </w:r>
             <w:r>
               <w:rPr>
-                <w:rFonts w:hint="cs" w:ascii="Arial" w:hAnsi="Arial" w:cs="Arial"/>
+                <w:rFonts w:hint="cs"/>
                 <w:b/>
                 <w:sz w:val="144"/>
                 <w:szCs w:val="48"/>
@@ -55,7 +53,6 @@
             </w:r>
             <w:r>
               <w:rPr>
-                <w:rFonts w:ascii="Arial" w:hAnsi="Arial" w:cs="Arial"/>
                 <w:b/>
                 <w:sz w:val="72"/>
                 <w:szCs w:val="48"/>
@@ -65,7 +62,7 @@
             </w:r>
             <w:r>
               <w:rPr>
-                <w:rFonts w:hint="cs" w:ascii="Arial" w:hAnsi="Arial" w:cs="Arial"/>
+                <w:rFonts w:hint="cs"/>
                 <w:b/>
                 <w:sz w:val="72"/>
                 <w:szCs w:val="48"/>
@@ -76,7 +73,6 @@
             </w:r>
             <w:r>
               <w:rPr>
-                <w:rFonts w:ascii="Arial" w:hAnsi="Arial" w:cs="Arial"/>
                 <w:b/>
                 <w:sz w:val="72"/>
                 <w:szCs w:val="48"/>
@@ -132,12 +128,10 @@
           <w:p>
             <w:pPr>
               <w:spacing w:after="40"/>
-              <w:bidi/>
-              <w:jc w:val="right"/>
+              <w:jc w:val="left"/>
             </w:pPr>
             <w:r>
               <w:rPr>
-                <w:rFonts w:ascii="Arial" w:hAnsi="Arial" w:cs="Arial"/>
                 <w:b/>
                 <w:sz w:val="20"/>
                 <w:rtl/>
@@ -146,7 +140,6 @@
             </w:r>
             <w:r>
               <w:rPr>
-                <w:rFonts w:ascii="Arial" w:hAnsi="Arial" w:cs="Arial"/>
                 <w:sz w:val="20"/>
                 <w:rtl/>
               </w:rPr>
@@ -156,12 +149,10 @@
           <w:p>
             <w:pPr>
               <w:spacing w:after="40"/>
-              <w:bidi/>
-              <w:jc w:val="right"/>
+              <w:jc w:val="left"/>
             </w:pPr>
             <w:r>
               <w:rPr>
-                <w:rFonts w:ascii="Arial" w:hAnsi="Arial" w:cs="Arial"/>
                 <w:b/>
                 <w:sz w:val="20"/>
                 <w:rtl/>
@@ -170,7 +161,6 @@
             </w:r>
             <w:r>
               <w:rPr>
-                <w:rFonts w:ascii="Arial" w:hAnsi="Arial" w:cs="Arial"/>
                 <w:sz w:val="20"/>
                 <w:rtl/>
               </w:rPr>
@@ -180,12 +170,10 @@
           <w:p>
             <w:pPr>
               <w:spacing w:after="40"/>
-              <w:bidi/>
-              <w:jc w:val="right"/>
+              <w:jc w:val="left"/>
             </w:pPr>
             <w:r>
               <w:rPr>
-                <w:rFonts w:ascii="Arial" w:hAnsi="Arial" w:cs="Arial"/>
                 <w:b/>
                 <w:sz w:val="20"/>
                 <w:rtl/>
@@ -194,7 +182,6 @@
             </w:r>
             <w:r>
               <w:rPr>
-                <w:rFonts w:ascii="Arial" w:hAnsi="Arial" w:cs="Arial"/>
                 <w:sz w:val="20"/>
                 <w:rtl/>
               </w:rPr>
@@ -204,12 +191,10 @@
           <w:p>
             <w:pPr>
               <w:spacing w:after="40"/>
-              <w:bidi/>
-              <w:jc w:val="right"/>
+              <w:jc w:val="left"/>
             </w:pPr>
             <w:r>
               <w:rPr>
-                <w:rFonts w:ascii="Arial" w:hAnsi="Arial" w:cs="Arial"/>
                 <w:b/>
                 <w:sz w:val="20"/>
                 <w:rtl/>
@@ -218,7 +203,6 @@
             </w:r>
             <w:r>
               <w:rPr>
-                <w:rFonts w:ascii="Arial" w:hAnsi="Arial" w:cs="Arial"/>
                 <w:sz w:val="20"/>
                 <w:rtl/>
               </w:rPr>
@@ -228,12 +212,10 @@
           <w:p>
             <w:pPr>
               <w:spacing w:after="40"/>
-              <w:bidi/>
-              <w:jc w:val="right"/>
+              <w:jc w:val="left"/>
             </w:pPr>
             <w:r>
               <w:rPr>
-                <w:rFonts w:ascii="Arial" w:hAnsi="Arial" w:cs="Arial"/>
                 <w:b/>
                 <w:sz w:val="20"/>
                 <w:rtl/>
@@ -242,7 +224,6 @@
             </w:r>
             <w:r>
               <w:rPr>
-                <w:rFonts w:ascii="Arial" w:hAnsi="Arial" w:cs="Arial"/>
                 <w:sz w:val="20"/>
                 <w:rtl/>
               </w:rPr>
@@ -255,12 +236,10 @@
     <w:p>
       <w:pPr>
         <w:spacing w:before="200" w:after="80"/>
-        <w:bidi/>
-        <w:jc w:val="right"/>
+        <w:jc w:val="left"/>
       </w:pPr>
       <w:r>
         <w:rPr>
-          <w:rFonts w:ascii="Arial" w:hAnsi="Arial" w:cs="Arial"/>
           <w:sz w:val="22"/>
           <w:rtl/>
         </w:rPr>
@@ -270,12 +249,10 @@
     <w:p>
       <w:pPr>
         <w:spacing w:before="120" w:after="120"/>
-        <w:bidi/>
-        <w:jc w:val="right"/>
+        <w:jc w:val="left"/>
       </w:pPr>
       <w:r>
         <w:rPr>
-          <w:rFonts w:ascii="Arial" w:hAnsi="Arial" w:cs="Arial"/>
           <w:b/>
           <w:rtl/>
         </w:rPr>
@@ -285,12 +262,10 @@
     <w:p>
       <w:pPr>
         <w:spacing w:after="120"/>
-        <w:bidi/>
-        <w:jc w:val="right"/>
+        <w:jc w:val="left"/>
       </w:pPr>
       <w:r>
         <w:rPr>
-          <w:rFonts w:ascii="Arial" w:hAnsi="Arial" w:cs="Arial"/>
           <w:i/>
           <w:sz w:val="20"/>
           <w:rtl/>
@@ -347,50 +322,36 @@
     <w:p>
       <w:pPr>
         <w:spacing w:after="40"/>
-        <w:bidi/>
-        <w:jc w:val="right"/>
+        <w:jc w:val="left"/>
       </w:pPr>
       <w:r>
         <w:rPr>
-          <w:rFonts w:ascii="Arial" w:hAnsi="Arial" w:cs="Arial"/>
           <w:sz w:val="22"/>
           <w:rtl/>
         </w:rPr>
-        <w:t xml:space="preserve">א. </w:t>
-      </w:r>
-      <w:r>
-        <w:rPr>
-          <w:rFonts w:ascii="Arial" w:hAnsi="Arial" w:cs="Arial"/>
-          <w:sz w:val="22"/>
-          <w:rtl/>
-        </w:rPr>
-        <w:t>TS1↔PG3, TS2↔PG2, TS3↔PG1</w:t>
+        <w:t>א. TS1↔PG1, TS2↔PG2, TS3↔PG3</w:t>
       </w:r>
     </w:p>
     <w:p>
       <w:pPr>
         <w:spacing w:after="40"/>
-        <w:bidi/>
-        <w:jc w:val="right"/>
+        <w:jc w:val="left"/>
       </w:pPr>
       <w:r>
         <w:rPr>
-          <w:rFonts w:ascii="Arial" w:hAnsi="Arial" w:cs="Arial"/>
           <w:sz w:val="22"/>
           <w:rtl/>
         </w:rPr>
-        <w:t>ב. TS1↔PG1, TS2↔PG2, TS3↔PG3</w:t>
+        <w:t>ב. TS1↔PG3, TS2↔PG2, TS3↔PG1</w:t>
       </w:r>
     </w:p>
     <w:p>
       <w:pPr>
         <w:spacing w:after="40"/>
-        <w:bidi/>
-        <w:jc w:val="right"/>
+        <w:jc w:val="left"/>
       </w:pPr>
       <w:r>
         <w:rPr>
-          <w:rFonts w:ascii="Arial" w:hAnsi="Arial" w:cs="Arial"/>
           <w:sz w:val="22"/>
           <w:rtl/>
         </w:rPr>
@@ -400,12 +361,10 @@
     <w:p>
       <w:pPr>
         <w:spacing w:after="40"/>
-        <w:bidi/>
-        <w:jc w:val="right"/>
+        <w:jc w:val="left"/>
       </w:pPr>
       <w:r>
         <w:rPr>
-          <w:rFonts w:ascii="Arial" w:hAnsi="Arial" w:cs="Arial"/>
           <w:sz w:val="22"/>
           <w:rtl/>
         </w:rPr>
@@ -415,12 +374,10 @@
     <w:p>
       <w:pPr>
         <w:spacing w:after="40"/>
-        <w:bidi/>
-        <w:jc w:val="right"/>
+        <w:jc w:val="left"/>
       </w:pPr>
       <w:r>
         <w:rPr>
-          <w:rFonts w:ascii="Arial" w:hAnsi="Arial" w:cs="Arial"/>
           <w:sz w:val="22"/>
           <w:rtl/>
         </w:rPr>
@@ -430,33 +387,22 @@
     <w:p>
       <w:pPr>
         <w:spacing w:after="40"/>
+        <w:jc w:val="left"/>
         <w:rPr>
           <w:sz w:val="22"/>
           <w:rtl/>
         </w:rPr>
-        <w:bidi/>
-        <w:jc w:val="right"/>
       </w:pPr>
       <w:r>
         <w:rPr>
-          <w:rFonts w:ascii="Arial" w:hAnsi="Arial" w:cs="Arial"/>
           <w:sz w:val="22"/>
           <w:rtl/>
         </w:rPr>
-        <w:t xml:space="preserve">ו. </w:t>
-      </w:r>
-      <w:r>
-        <w:rPr>
-          <w:rFonts w:ascii="Arial" w:hAnsi="Arial" w:cs="Arial"/>
-          <w:sz w:val="22"/>
-          <w:rtl/>
-        </w:rPr>
-        <w:t>TS1↔PG3, TS2↔PG1, TS3↔PG2</w:t>
+        <w:t>ו. TS1↔PG3, TS2↔PG1, TS3↔PG2</w:t>
       </w:r>
     </w:p>
     <w:p>
       <w:pPr>
-        <w:bidi w:val="0"/>
         <w:jc w:val="left"/>
         <w:rPr>
           <w:sz w:val="22"/>
@@ -474,12 +420,10 @@
     <w:p>
       <w:pPr>
         <w:spacing w:before="200" w:after="120"/>
-        <w:bidi/>
-        <w:jc w:val="right"/>
+        <w:jc w:val="left"/>
       </w:pPr>
       <w:r>
         <w:rPr>
-          <w:rFonts w:ascii="Arial" w:hAnsi="Arial" w:cs="Arial"/>
           <w:b/>
           <w:rtl/>
         </w:rPr>
@@ -536,12 +480,10 @@
     <w:p>
       <w:pPr>
         <w:spacing w:after="40"/>
-        <w:bidi/>
-        <w:jc w:val="right"/>
+        <w:jc w:val="left"/>
       </w:pPr>
       <w:r>
         <w:rPr>
-          <w:rFonts w:ascii="Arial" w:hAnsi="Arial" w:cs="Arial"/>
           <w:sz w:val="22"/>
           <w:rtl/>
         </w:rPr>
@@ -551,12 +493,10 @@
     <w:p>
       <w:pPr>
         <w:spacing w:after="40"/>
-        <w:bidi/>
-        <w:jc w:val="right"/>
+        <w:jc w:val="left"/>
       </w:pPr>
       <w:r>
         <w:rPr>
-          <w:rFonts w:ascii="Arial" w:hAnsi="Arial" w:cs="Arial"/>
           <w:sz w:val="22"/>
           <w:rtl/>
         </w:rPr>
@@ -566,12 +506,10 @@
     <w:p>
       <w:pPr>
         <w:spacing w:after="40"/>
-        <w:bidi/>
-        <w:jc w:val="right"/>
+        <w:jc w:val="left"/>
       </w:pPr>
       <w:r>
         <w:rPr>
-          <w:rFonts w:ascii="Arial" w:hAnsi="Arial" w:cs="Arial"/>
           <w:sz w:val="22"/>
           <w:rtl/>
         </w:rPr>
@@ -581,12 +519,10 @@
     <w:p>
       <w:pPr>
         <w:spacing w:after="40"/>
-        <w:bidi/>
-        <w:jc w:val="right"/>
+        <w:jc w:val="left"/>
       </w:pPr>
       <w:r>
         <w:rPr>
-          <w:rFonts w:ascii="Arial" w:hAnsi="Arial" w:cs="Arial"/>
           <w:sz w:val="22"/>
           <w:rtl/>
         </w:rPr>
@@ -596,12 +532,10 @@
     <w:p>
       <w:pPr>
         <w:spacing w:after="40"/>
-        <w:bidi/>
-        <w:jc w:val="right"/>
+        <w:jc w:val="left"/>
       </w:pPr>
       <w:r>
         <w:rPr>
-          <w:rFonts w:ascii="Arial" w:hAnsi="Arial" w:cs="Arial"/>
           <w:sz w:val="22"/>
           <w:rtl/>
         </w:rPr>
@@ -611,12 +545,10 @@
     <w:p>
       <w:pPr>
         <w:spacing w:after="40"/>
-        <w:bidi/>
-        <w:jc w:val="right"/>
+        <w:jc w:val="left"/>
       </w:pPr>
       <w:r>
         <w:rPr>
-          <w:rFonts w:ascii="Arial" w:hAnsi="Arial" w:cs="Arial"/>
           <w:sz w:val="22"/>
           <w:rtl/>
         </w:rPr>
@@ -624,6 +556,9 @@
       </w:r>
     </w:p>
     <w:p>
+      <w:pPr>
+        <w:jc w:val="left"/>
+      </w:pPr>
       <w:r>
         <w:br w:type="page"/>
       </w:r>
@@ -631,58 +566,219 @@
     <w:p>
       <w:pPr>
         <w:spacing w:before="120" w:after="120"/>
-        <w:bidi/>
-        <w:jc w:val="right"/>
+        <w:jc w:val="left"/>
       </w:pPr>
       <w:r>
         <w:rPr>
-          <w:rFonts w:ascii="Arial" w:hAnsi="Arial" w:cs="Arial"/>
           <w:b/>
-          <w:i w:val="0"/>
-          <w:sz w:val="24"/>
           <w:rtl/>
         </w:rPr>
-        <w:t>3. ?????? ??? ??????? ??????? ???? ?????? ??????? ???????? ???.</w:t>
+        <w:lastRenderedPageBreak/>
+        <w:t>3. התאימו בין המעגלים הלוגיים לבין מערכות המעברים המתקבלות מהם.</w:t>
       </w:r>
     </w:p>
     <w:p>
       <w:pPr>
         <w:spacing w:after="120"/>
-        <w:bidi/>
-        <w:jc w:val="right"/>
+        <w:jc w:val="left"/>
       </w:pPr>
       <w:r>
         <w:rPr>
-          <w:rFonts w:ascii="Arial" w:hAnsi="Arial" w:cs="Arial"/>
           <w:i/>
           <w:sz w:val="20"/>
           <w:rtl/>
         </w:rPr>
-        <w:t>????: ??? ???? x ??? ??? ???????, r ??? ????, y ??? ???, ?-r^+ ??? ??? ????? ?????? ???. ??? ?????? ??????? ??? ????? ?? x ??? r; ??? ???? ???? ??? x ???? ????? ??????? ?? ??? ??????, ???? ????? ??? ???? ??? ???????? ?????? ?? ?????. ???? ?????? ???? ?? ??? ?????? ?? ???????.</w:t>
+        <w:t xml:space="preserve">הערה: בכל מעגל </w:t>
+      </w:r>
+      <m:oMath>
+        <m:r>
+          <w:rPr>
+            <w:rFonts w:ascii="Cambria Math" w:hAnsi="Cambria Math" w:cs="Cambria Math" w:hint="cs"/>
+            <w:sz w:val="20"/>
+            <w:rtl/>
+          </w:rPr>
+          <m:t>x</m:t>
+        </m:r>
+      </m:oMath>
+      <w:r>
+        <w:rPr>
+          <w:i/>
+          <w:sz w:val="20"/>
+          <w:rtl/>
+        </w:rPr>
+        <w:t xml:space="preserve"> הוא קלט בוליאני, </w:t>
+      </w:r>
+      <m:oMath>
+        <m:r>
+          <w:rPr>
+            <w:rFonts w:ascii="Cambria Math" w:hAnsi="Cambria Math" w:cs="Cambria Math" w:hint="cs"/>
+            <w:sz w:val="20"/>
+            <w:rtl/>
+          </w:rPr>
+          <m:t>r</m:t>
+        </m:r>
+      </m:oMath>
+      <w:r>
+        <w:rPr>
+          <w:i/>
+          <w:sz w:val="20"/>
+          <w:rtl/>
+        </w:rPr>
+        <w:t xml:space="preserve"> הוא אוגר, ו-</w:t>
+      </w:r>
+      <m:oMath>
+        <m:r>
+          <w:rPr>
+            <w:rFonts w:ascii="Cambria Math" w:hAnsi="Cambria Math" w:cs="Cambria Math" w:hint="cs"/>
+            <w:sz w:val="20"/>
+            <w:rtl/>
+          </w:rPr>
+          <m:t>y</m:t>
+        </m:r>
+      </m:oMath>
+      <w:r>
+        <w:rPr>
+          <w:i/>
+          <w:sz w:val="20"/>
+          <w:rtl/>
+        </w:rPr>
+        <w:t xml:space="preserve"> הוא פלט. מצב במערכת המעברים הוא הערכה של </w:t>
+      </w:r>
+      <m:oMath>
+        <m:r>
+          <w:rPr>
+            <w:rFonts w:ascii="Cambria Math" w:hAnsi="Cambria Math" w:cs="Cambria Math" w:hint="cs"/>
+            <w:sz w:val="20"/>
+            <w:rtl/>
+          </w:rPr>
+          <m:t>x</m:t>
+        </m:r>
+      </m:oMath>
+      <w:r>
+        <w:rPr>
+          <w:i/>
+          <w:sz w:val="20"/>
+          <w:rtl/>
+        </w:rPr>
+        <w:t xml:space="preserve"> ושל </w:t>
+      </w:r>
+      <m:oMath>
+        <m:r>
+          <w:rPr>
+            <w:rFonts w:ascii="Cambria Math" w:hAnsi="Cambria Math" w:cs="Cambria Math" w:hint="cs"/>
+            <w:sz w:val="20"/>
+            <w:rtl/>
+          </w:rPr>
+          <m:t>r</m:t>
+        </m:r>
+      </m:oMath>
+      <w:r>
+        <w:rPr>
+          <w:i/>
+          <w:sz w:val="20"/>
+          <w:rtl/>
+        </w:rPr>
+        <w:t xml:space="preserve">; בכל מעבר הקלט הבא </w:t>
+      </w:r>
+      <m:oMath>
+        <m:r>
+          <w:rPr>
+            <w:rFonts w:ascii="Cambria Math" w:hAnsi="Cambria Math" w:cs="Cambria Math" w:hint="cs"/>
+            <w:sz w:val="20"/>
+            <w:rtl/>
+          </w:rPr>
+          <m:t>x</m:t>
+        </m:r>
+      </m:oMath>
+      <w:r>
+        <w:rPr>
+          <w:i/>
+          <w:sz w:val="20"/>
+          <w:rtl/>
+        </w:rPr>
+        <w:t xml:space="preserve"> נבחר באופן שרירותי על ידי הסביבה, וערך האוגר הבא נקבע לפי פונקציית העדכון של המעגל</w:t>
+      </w:r>
+      <w:r>
+        <w:rPr>
+          <w:rFonts w:hint="cs"/>
+          <w:i/>
+          <w:sz w:val="20"/>
+          <w:rtl/>
+          <w:lang w:bidi="he-IL"/>
+        </w:rPr>
+        <w:t xml:space="preserve"> על פי הקלט הקודם</w:t>
+      </w:r>
+      <w:r>
+        <w:rPr>
+          <w:i/>
+          <w:sz w:val="20"/>
+          <w:rtl/>
+        </w:rPr>
+        <w:t xml:space="preserve">. שמות המצבים שונו </w:t>
+      </w:r>
+      <w:r>
+        <w:rPr>
+          <w:rFonts w:hint="cs"/>
+          <w:i/>
+          <w:sz w:val="20"/>
+          <w:rtl/>
+          <w:lang w:bidi="he-IL"/>
+        </w:rPr>
+        <w:t xml:space="preserve">והתגיות הוסרו </w:t>
+      </w:r>
+      <w:r>
+        <w:rPr>
+          <w:i/>
+          <w:sz w:val="20"/>
+          <w:rtl/>
+        </w:rPr>
+        <w:t>כ</w:t>
+      </w:r>
+      <w:r>
+        <w:rPr>
+          <w:rFonts w:hint="cs"/>
+          <w:i/>
+          <w:sz w:val="20"/>
+          <w:rtl/>
+          <w:lang w:bidi="he-IL"/>
+        </w:rPr>
+        <w:t>די</w:t>
+      </w:r>
+      <w:r>
+        <w:rPr>
+          <w:i/>
+          <w:sz w:val="20"/>
+          <w:rtl/>
+        </w:rPr>
+        <w:t xml:space="preserve"> שלא יסגירו את ההערכות.</w:t>
       </w:r>
     </w:p>
     <w:p>
       <w:pPr>
         <w:spacing w:after="160"/>
-        <w:jc w:val="center"/>
+        <w:jc w:val="left"/>
       </w:pPr>
       <w:r>
+        <w:rPr>
+          <w:noProof/>
+        </w:rPr>
         <w:drawing>
-          <wp:inline xmlns:a="http://schemas.openxmlformats.org/drawingml/2006/main" xmlns:pic="http://schemas.openxmlformats.org/drawingml/2006/picture">
+          <wp:inline distT="0" distB="0" distL="0" distR="0" wp14:anchorId="09C11386" wp14:editId="4F16C21D">
             <wp:extent cx="6080760" cy="3198917"/>
+            <wp:effectExtent l="0" t="0" r="0" b="0"/>
             <wp:docPr id="3" name="Picture 3"/>
             <wp:cNvGraphicFramePr>
-              <a:graphicFrameLocks noChangeAspect="1"/>
+              <a:graphicFrameLocks xmlns:a="http://schemas.openxmlformats.org/drawingml/2006/main" noChangeAspect="1"/>
             </wp:cNvGraphicFramePr>
-            <a:graphic>
+            <a:graphic xmlns:a="http://schemas.openxmlformats.org/drawingml/2006/main">
               <a:graphicData uri="http://schemas.openxmlformats.org/drawingml/2006/picture">
-                <pic:pic>
+                <pic:pic xmlns:pic="http://schemas.openxmlformats.org/drawingml/2006/picture">
                   <pic:nvPicPr>
                     <pic:cNvPr id="0" name="logic_circuits_matching_matrix.png"/>
                     <pic:cNvPicPr/>
                   </pic:nvPicPr>
                   <pic:blipFill>
-                    <a:blip r:embed="rId10"/>
+                    <a:blip r:embed="rId8"/>
                     <a:stretch>
                       <a:fillRect/>
                     </a:stretch>
@@ -692,7 +788,9 @@
                       <a:off x="0" y="0"/>
                       <a:ext cx="6080760" cy="3198917"/>
                     </a:xfrm>
-                    <a:prstGeom prst="rect"/>
+                    <a:prstGeom prst="rect">
+                      <a:avLst/>
+                    </a:prstGeom>
                   </pic:spPr>
                 </pic:pic>
               </a:graphicData>
@@ -704,6 +802,105 @@
     <w:p>
       <w:pPr>
         <w:spacing w:after="40"/>
+        <w:jc w:val="left"/>
+      </w:pPr>
+      <w:r>
+        <w:rPr>
+          <w:sz w:val="22"/>
+          <w:rtl/>
+        </w:rPr>
+        <w:t>א. T1↔C2, T2↔C3, T3↔C1</w:t>
+      </w:r>
+    </w:p>
+    <w:p>
+      <w:pPr>
+        <w:spacing w:after="40"/>
+        <w:jc w:val="left"/>
+      </w:pPr>
+      <w:r>
+        <w:rPr>
+          <w:sz w:val="22"/>
+          <w:rtl/>
+        </w:rPr>
+        <w:t>ב. T1↔C1, T2↔C2, T3↔C3</w:t>
+      </w:r>
+    </w:p>
+    <w:p>
+      <w:pPr>
+        <w:spacing w:after="40"/>
+        <w:jc w:val="left"/>
+      </w:pPr>
+      <w:r>
+        <w:rPr>
+          <w:sz w:val="22"/>
+          <w:rtl/>
+        </w:rPr>
+        <w:t>ג. T1↔C3, T2↔C1, T3↔C2</w:t>
+      </w:r>
+    </w:p>
+    <w:p>
+      <w:pPr>
+        <w:spacing w:after="40"/>
+        <w:jc w:val="left"/>
+      </w:pPr>
+      <w:r>
+        <w:rPr>
+          <w:sz w:val="22"/>
+          <w:rtl/>
+        </w:rPr>
+        <w:t>ד. T1↔C1, T2↔C3, T3↔C2</w:t>
+      </w:r>
+    </w:p>
+    <w:p>
+      <w:pPr>
+        <w:spacing w:after="40"/>
+        <w:jc w:val="left"/>
+      </w:pPr>
+      <w:r>
+        <w:rPr>
+          <w:sz w:val="22"/>
+          <w:rtl/>
+        </w:rPr>
+        <w:t>ה. T1↔C2, T2↔C1, T3↔C3</w:t>
+      </w:r>
+    </w:p>
+    <w:p>
+      <w:pPr>
+        <w:spacing w:after="40"/>
+        <w:jc w:val="left"/>
+      </w:pPr>
+      <w:r>
+        <w:rPr>
+          <w:sz w:val="22"/>
+          <w:rtl/>
+        </w:rPr>
+        <w:t>ו. T1↔C3, T2↔C2, T3↔C1</w:t>
+      </w:r>
+    </w:p>
+    <w:p>
+      <w:r>
+        <w:br w:type="page"/>
+      </w:r>
+    </w:p>
+    <w:p>
+      <w:pPr>
+        <w:spacing w:after="80"/>
+        <w:bidi/>
+        <w:jc w:val="right"/>
+      </w:pPr>
+      <w:r>
+        <w:rPr>
+          <w:rFonts w:ascii="Arial" w:hAnsi="Arial" w:cs="Arial"/>
+          <w:b/>
+          <w:sz w:val="24"/>
+          <w:rtl/>
+        </w:rPr>
+        <w:t>4. נתון קטע הקוד הבא ב-NanoPromela. איזה מבין גרפי התוכנית הבאים הוא הפריסה הנכונה של הקוד?</w:t>
+      </w:r>
+    </w:p>
+    <w:p>
+      <w:pPr>
+        <w:spacing w:after="80"/>
         <w:bidi/>
         <w:jc w:val="right"/>
       </w:pPr>
@@ -711,16 +908,48 @@
         <w:rPr>
           <w:rFonts w:ascii="Arial" w:hAnsi="Arial" w:cs="Arial"/>
           <w:b w:val="0"/>
-          <w:i w:val="0"/>
           <w:sz w:val="22"/>
           <w:rtl/>
         </w:rPr>
-        <w:t>?. T1?C1, T2?C2, T3?C3</w:t>
+        <w:t>הניחו כי x,y,z הם משתנים שלמים. שימו לב: בבחירת guarded command, בדיקת התנאי והפעולה האטומית הראשונה של הענף שנבחר מתבצעות כצעד אטומי אחד.</w:t>
       </w:r>
     </w:p>
     <w:p>
       <w:pPr>
-        <w:spacing w:after="40"/>
+        <w:spacing w:before="40" w:after="120"/>
+        <w:jc w:val="left"/>
+      </w:pPr>
+      <w:r>
+        <w:rPr>
+          <w:rFonts w:ascii="Courier New" w:hAnsi="Courier New" w:cs="Courier New"/>
+          <w:sz w:val="18"/>
+        </w:rPr>
+        <w:t>do</w:t>
+        <w:br/>
+        <w:t>:: x &lt; 2 -&gt;</w:t>
+        <w:br/>
+        <w:t xml:space="preserve">     x := x + 1;</w:t>
+        <w:br/>
+        <w:t xml:space="preserve">     if</w:t>
+        <w:br/>
+        <w:t xml:space="preserve">     :: y = 0 -&gt; y := 1</w:t>
+        <w:br/>
+        <w:t xml:space="preserve">     :: y = 1 -&gt; y := 0; z := z + 1</w:t>
+        <w:br/>
+        <w:t xml:space="preserve">     fi</w:t>
+        <w:br/>
+        <w:t>:: x = 2 -&gt;</w:t>
+        <w:br/>
+        <w:t xml:space="preserve">     atomic{ y := 1; x := x + 1 }</w:t>
+        <w:br/>
+        <w:t>od;</w:t>
+        <w:br/>
+        <w:t>z := z + 1</w:t>
+      </w:r>
+    </w:p>
+    <w:p>
+      <w:pPr>
+        <w:spacing w:after="80"/>
         <w:bidi/>
         <w:jc w:val="right"/>
       </w:pPr>
@@ -728,79 +957,49 @@
         <w:rPr>
           <w:rFonts w:ascii="Arial" w:hAnsi="Arial" w:cs="Arial"/>
           <w:b w:val="0"/>
-          <w:i w:val="0"/>
           <w:sz w:val="22"/>
           <w:rtl/>
         </w:rPr>
-        <w:t>?. T1?C3, T2?C1, T3?C2</w:t>
+        <w:t>האפשרויות מסומנות באיור בשמות PG_1,...,PG_6.</w:t>
       </w:r>
     </w:p>
     <w:p>
       <w:pPr>
-        <w:spacing w:after="40"/>
-        <w:bidi/>
-        <w:jc w:val="right"/>
+        <w:jc w:val="center"/>
       </w:pPr>
       <w:r>
-        <w:rPr>
-          <w:rFonts w:ascii="Arial" w:hAnsi="Arial" w:cs="Arial"/>
-          <w:b w:val="0"/>
-          <w:i w:val="0"/>
-          <w:sz w:val="22"/>
-          <w:rtl/>
-        </w:rPr>
-        <w:t>?. T1?C2, T2?C3, T3?C1</w:t>
-      </w:r>
-    </w:p>
-    <w:p>
-      <w:pPr>
-        <w:spacing w:after="40"/>
-        <w:bidi/>
-        <w:jc w:val="right"/>
-      </w:pPr>
-      <w:r>
-        <w:rPr>
-          <w:rFonts w:ascii="Arial" w:hAnsi="Arial" w:cs="Arial"/>
-          <w:b w:val="0"/>
-          <w:i w:val="0"/>
-          <w:sz w:val="22"/>
-          <w:rtl/>
-        </w:rPr>
-        <w:t>?. T1?C1, T2?C3, T3?C2</w:t>
-      </w:r>
-    </w:p>
-    <w:p>
-      <w:pPr>
-        <w:spacing w:after="40"/>
-        <w:bidi/>
-        <w:jc w:val="right"/>
-      </w:pPr>
-      <w:r>
-        <w:rPr>
-          <w:rFonts w:ascii="Arial" w:hAnsi="Arial" w:cs="Arial"/>
-          <w:b w:val="0"/>
-          <w:i w:val="0"/>
-          <w:sz w:val="22"/>
-          <w:rtl/>
-        </w:rPr>
-        <w:t>?. T1?C2, T2?C1, T3?C3</w:t>
-      </w:r>
-    </w:p>
-    <w:p>
-      <w:pPr>
-        <w:spacing w:after="40"/>
-        <w:bidi/>
-        <w:jc w:val="right"/>
-      </w:pPr>
-      <w:r>
-        <w:rPr>
-          <w:rFonts w:ascii="Arial" w:hAnsi="Arial" w:cs="Arial"/>
-          <w:b w:val="0"/>
-          <w:i w:val="0"/>
-          <w:sz w:val="22"/>
-          <w:rtl/>
-        </w:rPr>
-        <w:t>?. T1?C3, T2?C2, T3?C1</w:t>
+        <w:drawing>
+          <wp:inline xmlns:a="http://schemas.openxmlformats.org/drawingml/2006/main" xmlns:pic="http://schemas.openxmlformats.org/drawingml/2006/picture">
+            <wp:extent cx="5852160" cy="6401999"/>
+            <wp:docPr id="4" name="Picture 4"/>
+            <wp:cNvGraphicFramePr>
+              <a:graphicFrameLocks noChangeAspect="1"/>
+            </wp:cNvGraphicFramePr>
+            <a:graphic>
+              <a:graphicData uri="http://schemas.openxmlformats.org/drawingml/2006/picture">
+                <pic:pic>
+                  <pic:nvPicPr>
+                    <pic:cNvPr id="0" name="nanopromela_unfolding_graphs.png"/>
+                    <pic:cNvPicPr/>
+                  </pic:nvPicPr>
+                  <pic:blipFill>
+                    <a:blip r:embed="rId11"/>
+                    <a:stretch>
+                      <a:fillRect/>
+                    </a:stretch>
+                  </pic:blipFill>
+                  <pic:spPr>
+                    <a:xfrm>
+                      <a:off x="0" y="0"/>
+                      <a:ext cx="5852160" cy="6401999"/>
+                    </a:xfrm>
+                    <a:prstGeom prst="rect"/>
+                  </pic:spPr>
+                </pic:pic>
+              </a:graphicData>
+            </a:graphic>
+          </wp:inline>
+        </w:drawing>
       </w:r>
     </w:p>
     <w:sectPr>

</xml_diff>